<commit_message>
Remove pause-screen "AI got it wrong" story from report and slides
Git history shows Jeb's account did author the original pause-screen
commit; the "AI wrongly credited a teammate" example no longer holds
up, so it's dropped from REPORT.md, the IEEE docx, the interaction log
(row 11), and both slides (9 and 10), with the AI-interaction-log rows
renumbered.

Co-Authored-By: Claude Sonnet 5 <noreply@anthropic.com>
</commit_message>
<xml_diff>
--- a/docs/report/CT3201_Report_IEEE.docx
+++ b/docs/report/CT3201_Report_IEEE.docx
@@ -15920,7 +15920,7 @@
           <w:i w:val="0"/>
           <w:sz w:val="20"/>
         </w:rPr>
-        <w:t xml:space="preserve"> The generative video model couldn’t produce a usable walk-toward-camera animation for the occupant NPCs, only unstable side-view clips. It also recommended Greedy Best-First as “faster” without weighing that “faster to compute” is not “safer route”. Later in the project it also got a fact wrong, not just a design judgement: it wrongly credited a teammate as the sole author of the (real, working) pause-screen feature, based only on a git commit being under his account. We caught this — a commit only proves which account was used, not who actually typed the code — and made it correct the claim rather than repeat it.</w:t>
+        <w:t xml:space="preserve"> The generative video model couldn’t produce a usable walk-toward-camera animation for the occupant NPCs, only unstable side-view clips. It also recommended Greedy Best-First as “faster” without weighing that “faster to compute” is not “safer route”.</w:t>
       </w:r>
     </w:p>
     <w:p>
@@ -16151,7 +16151,7 @@
           <w:i w:val="0"/>
           <w:sz w:val="20"/>
         </w:rPr>
-        <w:t xml:space="preserve"> Recognising that the AI-video failure was narrow (one model, one axis) and could be routed around rather than abandoning AI art entirely. Deciding the scope reduction (occupant NPCs don’t need 4 walk directions). Choosing to keep BFS where it’s genuinely correct. Catching the wrong claim about who wrote the pause screen. Judging whether the UI actually looked “fancy” or “professional” enough — that’s a subjective call AI can’t make for us. Deciding what gets committed, to which branch, and refusing to let AI merge or open pull requests on its own, even though it was technically capable of it.</w:t>
+        <w:t xml:space="preserve"> Recognising that the AI-video failure was narrow (one model, one axis) and could be routed around rather than abandoning AI art entirely. Deciding the scope reduction (occupant NPCs don’t need 4 walk directions). Choosing to keep BFS where it’s genuinely correct. Judging whether the UI actually looked “fancy” or “professional” enough — that’s a subjective call AI can’t make for us. Deciding what gets committed, to which branch, and refusing to let AI merge or open pull requests on its own, even though it was technically capable of it.</w:t>
       </w:r>
     </w:p>
     <w:p>
@@ -16184,7 +16184,7 @@
           <w:i w:val="0"/>
           <w:sz w:val="20"/>
         </w:rPr>
-        <w:t xml:space="preserve"> With Greedy Best-First, the agent would lead people through the fire whenever the exit was roughly beyond it — taking heavy damage, sometimes dying mid-escort and losing everyone — while reporting a “shorter” path. It would look like bad game balance, not a wrong algorithm choice, and we’d have debugged the wrong thing. If we’d trusted the pause-screen claim, we’d have told a teammate he built something he says he didn’t. If we’d let it merge or open PRs freely, it could have collided with a teammate’s parallel work on master without anyone agreeing to it first.</w:t>
+        <w:t xml:space="preserve"> With Greedy Best-First, the agent would lead people through the fire whenever the exit was roughly beyond it — taking heavy damage, sometimes dying mid-escort and losing everyone — while reporting a “shorter” path. It would look like bad game balance, not a wrong algorithm choice, and we’d have debugged the wrong thing. If we’d let it merge or open PRs freely, it could have collided with a teammate’s parallel work on master without anyone agreeing to it first.</w:t>
       </w:r>
     </w:p>
     <w:p>

</xml_diff>